<commit_message>
fix: repair extraction reliability and portable library references
Preserve conversion outputs, validate extraction and Word content, correct mathematical examples, withdraw unsupported exam statistics, and resolve knowledge roots across Windows and Linux.

Includes verified local commits 3f0a20b, 4f5c17a, and f397902. Local regression: 80 tests passed; updated atlas: 34 pages visually reviewed. No full textbooks included.
</commit_message>
<xml_diff>
--- a/真题考点/天津/家长版/天津中考化学_给家长的备考说明_2022-2026.docx
+++ b/真题考点/天津/家长版/天津中考化学_给家长的备考说明_2022-2026.docx
@@ -4,1525 +4,522 @@
   <w:body>
     <w:p>
       <w:pPr>
-        <w:spacing w:before="120" w:after="40"/>
-        <w:jc w:val="center"/>
+        <w:pStyle w:val="Title"/>
       </w:pPr>
       <w:r>
-        <w:rPr>
-          <w:rFonts w:ascii="Times New Roman" w:hAnsi="Times New Roman" w:eastAsia="黑体"/>
-          <w:b/>
-          <w:color w:val="1F3A5F"/>
-          <w:sz w:val="38"/>
-        </w:rPr>
-        <w:t>天津中考化学 · 给家长的备考说明</w:t>
+        <w:t>天津中考化学给家长的备考说明</w:t>
+      </w:r>
+    </w:p>
+    <w:p>
+      <w:r>
+        <w:t>2022至2026年资料核验修订  2026年10月21日</w:t>
+      </w:r>
+    </w:p>
+    <w:p>
+      <w:r>
+        <w:t>这份说明保留基础练习建议。原资料中的五年频次、固定题号和“必拿分”结论缺少完整逐题证据，已撤回。请根据孩子实际错题安排学习，不把旧统计当作考试预测或得分保证。</w:t>
       </w:r>
     </w:p>
     <w:p>
       <w:pPr>
-        <w:jc w:val="center"/>
+        <w:pStyle w:val="Heading1"/>
       </w:pPr>
       <w:r>
-        <w:rPr>
-          <w:rFonts w:ascii="Times New Roman" w:hAnsi="Times New Roman" w:eastAsia="宋体"/>
-          <w:b w:val="0"/>
-          <w:color w:val="595959"/>
-          <w:sz w:val="23"/>
-        </w:rPr>
-        <w:t>依据 2022—2026 五年真题梳理，告诉您孩子该把劲往哪使</w:t>
+        <w:t>一 先确认考试信息</w:t>
       </w:r>
     </w:p>
     <w:p>
       <w:r>
-        <w:rPr>
-          <w:rFonts w:ascii="Times New Roman" w:hAnsi="Times New Roman" w:eastAsia="宋体"/>
-          <w:b w:val="0"/>
-          <w:sz w:val="23"/>
-        </w:rPr>
-        <w:t>这份说明不堆题目、也不用专业术语，只把五年天津中考化学里最稳定的规律讲清楚：卷子长什么样、哪些分一定要拿到、哪些题量力而行、补习从哪入手。您看完心里就有数了。</w:t>
+        <w:t>考试时长、题量、分值和多选题计分规则，请核对对应年份的正式试卷或考试说明。正在核验的旧记录不能替代这些信息。</w:t>
       </w:r>
     </w:p>
     <w:p>
       <w:pPr>
-        <w:shd w:val="clear" w:fill="DEEBF7"/>
-        <w:spacing w:before="240" w:after="100"/>
+        <w:pStyle w:val="Heading1"/>
       </w:pPr>
       <w:r>
-        <w:rPr>
-          <w:rFonts w:ascii="Times New Roman" w:hAnsi="Times New Roman" w:eastAsia="黑体"/>
-          <w:b/>
-          <w:color w:val="1F3A5F"/>
-          <w:sz w:val="27"/>
-        </w:rPr>
-        <w:t>一、先看懂孩子要面对的这张卷子</w:t>
-      </w:r>
-    </w:p>
-    <w:p>
-      <w:r>
-        <w:rPr>
-          <w:rFonts w:ascii="Times New Roman" w:hAnsi="Times New Roman" w:eastAsia="宋体"/>
-          <w:b w:val="0"/>
-          <w:sz w:val="23"/>
-        </w:rPr>
-        <w:t xml:space="preserve">化学满分 </w:t>
-      </w:r>
-      <w:r>
-        <w:rPr>
-          <w:rFonts w:ascii="Times New Roman" w:hAnsi="Times New Roman" w:eastAsia="宋体"/>
-          <w:b/>
-          <w:sz w:val="23"/>
-        </w:rPr>
-        <w:t>100 分</w:t>
-      </w:r>
-      <w:r>
-        <w:rPr>
-          <w:rFonts w:ascii="Times New Roman" w:hAnsi="Times New Roman" w:eastAsia="宋体"/>
-          <w:b w:val="0"/>
-          <w:sz w:val="23"/>
-        </w:rPr>
-        <w:t xml:space="preserve">，和物理合在一场考，共用 </w:t>
-      </w:r>
-      <w:r>
-        <w:rPr>
-          <w:rFonts w:ascii="Times New Roman" w:hAnsi="Times New Roman" w:eastAsia="宋体"/>
-          <w:b/>
-          <w:sz w:val="23"/>
-        </w:rPr>
-        <w:t>120 分钟</w:t>
-      </w:r>
-      <w:r>
-        <w:rPr>
-          <w:rFonts w:ascii="Times New Roman" w:hAnsi="Times New Roman" w:eastAsia="宋体"/>
-          <w:b w:val="0"/>
-          <w:sz w:val="23"/>
-        </w:rPr>
-        <w:t xml:space="preserve">。全卷一共 </w:t>
-      </w:r>
-      <w:r>
-        <w:rPr>
-          <w:rFonts w:ascii="Times New Roman" w:hAnsi="Times New Roman" w:eastAsia="宋体"/>
-          <w:b/>
-          <w:sz w:val="23"/>
-        </w:rPr>
-        <w:t>26 道题</w:t>
-      </w:r>
-      <w:r>
-        <w:rPr>
-          <w:rFonts w:ascii="Times New Roman" w:hAnsi="Times New Roman" w:eastAsia="宋体"/>
-          <w:b w:val="0"/>
-          <w:sz w:val="23"/>
-        </w:rPr>
-        <w:t>：</w:t>
+        <w:t>二 先练基础知识</w:t>
       </w:r>
     </w:p>
     <w:tbl>
       <w:tblPr>
-        <w:tblStyle w:val="TableGrid"/>
         <w:tblW w:type="auto" w:w="0"/>
+        <w:jc w:val="center"/>
+        <w:tblLayout w:type="fixed"/>
         <w:tblLook w:firstColumn="1" w:firstRow="1" w:lastColumn="0" w:lastRow="0" w:noHBand="0" w:noVBand="1" w:val="04A0"/>
+        <w:tblBorders>
+          <w:top w:val="single" w:sz="4" w:color="D9D9D9"/>
+          <w:left w:val="single" w:sz="4" w:color="D9D9D9"/>
+          <w:bottom w:val="single" w:sz="4" w:color="D9D9D9"/>
+          <w:right w:val="single" w:sz="4" w:color="D9D9D9"/>
+          <w:insideH w:val="single" w:sz="4" w:color="D9D9D9"/>
+          <w:insideV w:val="single" w:sz="4" w:color="D9D9D9"/>
+        </w:tblBorders>
       </w:tblPr>
       <w:tblGrid>
-        <w:gridCol w:w="2466"/>
-        <w:gridCol w:w="2466"/>
-        <w:gridCol w:w="2466"/>
-        <w:gridCol w:w="2466"/>
+        <w:gridCol w:w="2268"/>
+        <w:gridCol w:w="3969"/>
+        <w:gridCol w:w="3969"/>
       </w:tblGrid>
       <w:tr>
         <w:trPr>
-          <w:tblHeader w:val="true"/>
+          <w:tblHeader/>
+          <w:cantSplit/>
         </w:trPr>
         <w:tc>
           <w:tcPr>
-            <w:tcW w:type="dxa" w:w="2466"/>
-            <w:shd w:val="clear" w:fill="1F4E79"/>
+            <w:tcW w:type="dxa" w:w="2268"/>
+            <w:vAlign w:val="center"/>
+            <w:tcMar>
+              <w:top w:w="70" w:type="dxa"/>
+              <w:left w:w="70" w:type="dxa"/>
+              <w:bottom w:w="70" w:type="dxa"/>
+              <w:right w:w="70" w:type="dxa"/>
+            </w:tcMar>
+            <w:shd w:fill="E8EEF5"/>
           </w:tcPr>
           <w:p>
             <w:pPr>
-              <w:spacing w:after="20"/>
+              <w:spacing w:after="0" w:line="252" w:lineRule="auto"/>
             </w:pPr>
-            <w:r/>
             <w:r>
               <w:rPr>
-                <w:rFonts w:ascii="Times New Roman" w:hAnsi="Times New Roman" w:eastAsia="黑体"/>
                 <w:b/>
-                <w:color w:val="FFFFFF"/>
-                <w:sz w:val="21"/>
+                <w:sz w:val="19"/>
               </w:rPr>
-              <w:t>题型</w:t>
+              <w:t>学习内容</w:t>
             </w:r>
           </w:p>
         </w:tc>
         <w:tc>
           <w:tcPr>
-            <w:tcW w:type="dxa" w:w="2466"/>
-            <w:shd w:val="clear" w:fill="1F4E79"/>
+            <w:tcW w:type="dxa" w:w="3969"/>
+            <w:vAlign w:val="center"/>
+            <w:tcMar>
+              <w:top w:w="70" w:type="dxa"/>
+              <w:left w:w="70" w:type="dxa"/>
+              <w:bottom w:w="70" w:type="dxa"/>
+              <w:right w:w="70" w:type="dxa"/>
+            </w:tcMar>
+            <w:shd w:fill="E8EEF5"/>
           </w:tcPr>
           <w:p>
             <w:pPr>
-              <w:spacing w:after="20"/>
+              <w:spacing w:after="0" w:line="252" w:lineRule="auto"/>
             </w:pPr>
-            <w:r/>
             <w:r>
               <w:rPr>
-                <w:rFonts w:ascii="Times New Roman" w:hAnsi="Times New Roman" w:eastAsia="黑体"/>
                 <w:b/>
-                <w:color w:val="FFFFFF"/>
-                <w:sz w:val="21"/>
+                <w:sz w:val="19"/>
               </w:rPr>
-              <w:t>数量</w:t>
+              <w:t>练习重点</w:t>
             </w:r>
           </w:p>
         </w:tc>
         <w:tc>
           <w:tcPr>
-            <w:tcW w:type="dxa" w:w="2466"/>
-            <w:shd w:val="clear" w:fill="1F4E79"/>
+            <w:tcW w:type="dxa" w:w="3969"/>
+            <w:vAlign w:val="center"/>
+            <w:tcMar>
+              <w:top w:w="70" w:type="dxa"/>
+              <w:left w:w="70" w:type="dxa"/>
+              <w:bottom w:w="70" w:type="dxa"/>
+              <w:right w:w="70" w:type="dxa"/>
+            </w:tcMar>
+            <w:shd w:fill="E8EEF5"/>
           </w:tcPr>
           <w:p>
             <w:pPr>
-              <w:spacing w:after="20"/>
+              <w:spacing w:after="0" w:line="252" w:lineRule="auto"/>
             </w:pPr>
-            <w:r/>
             <w:r>
               <w:rPr>
-                <w:rFonts w:ascii="Times New Roman" w:hAnsi="Times New Roman" w:eastAsia="黑体"/>
                 <w:b/>
-                <w:color w:val="FFFFFF"/>
-                <w:sz w:val="21"/>
+                <w:sz w:val="19"/>
               </w:rPr>
-              <w:t>分值</w:t>
+              <w:t>家长可检查的表现</w:t>
+            </w:r>
+          </w:p>
+        </w:tc>
+      </w:tr>
+      <w:tr>
+        <w:trPr>
+          <w:cantSplit/>
+        </w:trPr>
+        <w:tc>
+          <w:tcPr>
+            <w:tcW w:type="dxa" w:w="2268"/>
+            <w:vAlign w:val="center"/>
+            <w:tcMar>
+              <w:top w:w="70" w:type="dxa"/>
+              <w:left w:w="70" w:type="dxa"/>
+              <w:bottom w:w="70" w:type="dxa"/>
+              <w:right w:w="70" w:type="dxa"/>
+            </w:tcMar>
+            <w:shd w:fill="FFFFFF"/>
+          </w:tcPr>
+          <w:p>
+            <w:pPr>
+              <w:spacing w:after="0" w:line="252" w:lineRule="auto"/>
+            </w:pPr>
+            <w:r>
+              <w:rPr>
+                <w:b w:val="0"/>
+                <w:sz w:val="19"/>
+              </w:rPr>
+              <w:t>化学用语与方程式</w:t>
             </w:r>
           </w:p>
         </w:tc>
         <w:tc>
           <w:tcPr>
-            <w:tcW w:type="dxa" w:w="2466"/>
-            <w:shd w:val="clear" w:fill="1F4E79"/>
+            <w:tcW w:type="dxa" w:w="3969"/>
+            <w:vAlign w:val="center"/>
+            <w:tcMar>
+              <w:top w:w="70" w:type="dxa"/>
+              <w:left w:w="70" w:type="dxa"/>
+              <w:bottom w:w="70" w:type="dxa"/>
+              <w:right w:w="70" w:type="dxa"/>
+            </w:tcMar>
+            <w:shd w:fill="FFFFFF"/>
           </w:tcPr>
           <w:p>
             <w:pPr>
-              <w:spacing w:after="20"/>
+              <w:spacing w:after="0" w:line="252" w:lineRule="auto"/>
             </w:pPr>
-            <w:r/>
             <w:r>
               <w:rPr>
-                <w:rFonts w:ascii="Times New Roman" w:hAnsi="Times New Roman" w:eastAsia="黑体"/>
-                <w:b/>
-                <w:color w:val="FFFFFF"/>
-                <w:sz w:val="21"/>
+                <w:b w:val="0"/>
+                <w:sz w:val="19"/>
               </w:rPr>
-              <w:t>通俗解释</w:t>
+              <w:t>元素符号、化合价和配平</w:t>
+            </w:r>
+          </w:p>
+        </w:tc>
+        <w:tc>
+          <w:tcPr>
+            <w:tcW w:type="dxa" w:w="3969"/>
+            <w:vAlign w:val="center"/>
+            <w:tcMar>
+              <w:top w:w="70" w:type="dxa"/>
+              <w:left w:w="70" w:type="dxa"/>
+              <w:bottom w:w="70" w:type="dxa"/>
+              <w:right w:w="70" w:type="dxa"/>
+            </w:tcMar>
+            <w:shd w:fill="FFFFFF"/>
+          </w:tcPr>
+          <w:p>
+            <w:pPr>
+              <w:spacing w:after="0" w:line="252" w:lineRule="auto"/>
+            </w:pPr>
+            <w:r>
+              <w:rPr>
+                <w:b w:val="0"/>
+                <w:sz w:val="19"/>
+              </w:rPr>
+              <w:t>检查原子数守恒、状态及反应条件</w:t>
             </w:r>
           </w:p>
         </w:tc>
       </w:tr>
       <w:tr>
+        <w:trPr>
+          <w:cantSplit/>
+        </w:trPr>
         <w:tc>
           <w:tcPr>
-            <w:tcW w:type="dxa" w:w="2466"/>
+            <w:tcW w:type="dxa" w:w="2268"/>
+            <w:vAlign w:val="center"/>
+            <w:tcMar>
+              <w:top w:w="70" w:type="dxa"/>
+              <w:left w:w="70" w:type="dxa"/>
+              <w:bottom w:w="70" w:type="dxa"/>
+              <w:right w:w="70" w:type="dxa"/>
+            </w:tcMar>
+            <w:shd w:fill="F7F8FA"/>
           </w:tcPr>
           <w:p>
             <w:pPr>
-              <w:spacing w:after="20"/>
+              <w:spacing w:after="0" w:line="252" w:lineRule="auto"/>
             </w:pPr>
             <w:r>
               <w:rPr>
-                <w:rFonts w:ascii="Times New Roman" w:hAnsi="Times New Roman" w:eastAsia="宋体"/>
                 <w:b w:val="0"/>
-                <w:sz w:val="21"/>
+                <w:sz w:val="19"/>
               </w:rPr>
-              <w:t>选择题</w:t>
+              <w:t>常见物质性质</w:t>
             </w:r>
           </w:p>
         </w:tc>
         <w:tc>
           <w:tcPr>
-            <w:tcW w:type="dxa" w:w="2466"/>
+            <w:tcW w:type="dxa" w:w="3969"/>
+            <w:vAlign w:val="center"/>
+            <w:tcMar>
+              <w:top w:w="70" w:type="dxa"/>
+              <w:left w:w="70" w:type="dxa"/>
+              <w:bottom w:w="70" w:type="dxa"/>
+              <w:right w:w="70" w:type="dxa"/>
+            </w:tcMar>
+            <w:shd w:fill="F7F8FA"/>
           </w:tcPr>
           <w:p>
             <w:pPr>
-              <w:spacing w:after="20"/>
+              <w:spacing w:after="0" w:line="252" w:lineRule="auto"/>
             </w:pPr>
             <w:r>
               <w:rPr>
-                <w:rFonts w:ascii="Times New Roman" w:hAnsi="Times New Roman" w:eastAsia="宋体"/>
                 <w:b w:val="0"/>
-                <w:sz w:val="21"/>
+                <w:sz w:val="19"/>
               </w:rPr>
-              <w:t>15 道</w:t>
+              <w:t>性质、用途与分类</w:t>
             </w:r>
           </w:p>
         </w:tc>
         <w:tc>
           <w:tcPr>
-            <w:tcW w:type="dxa" w:w="2466"/>
+            <w:tcW w:type="dxa" w:w="3969"/>
+            <w:vAlign w:val="center"/>
+            <w:tcMar>
+              <w:top w:w="70" w:type="dxa"/>
+              <w:left w:w="70" w:type="dxa"/>
+              <w:bottom w:w="70" w:type="dxa"/>
+              <w:right w:w="70" w:type="dxa"/>
+            </w:tcMar>
+            <w:shd w:fill="F7F8FA"/>
           </w:tcPr>
           <w:p>
             <w:pPr>
-              <w:spacing w:after="20"/>
+              <w:spacing w:after="0" w:line="252" w:lineRule="auto"/>
             </w:pPr>
             <w:r>
               <w:rPr>
-                <w:rFonts w:ascii="Times New Roman" w:hAnsi="Times New Roman" w:eastAsia="宋体"/>
                 <w:b w:val="0"/>
-                <w:sz w:val="21"/>
+                <w:sz w:val="19"/>
               </w:rPr>
-              <w:t>每题 2 分，共 30 分</w:t>
+              <w:t>用反应或现象说明判断依据</w:t>
+            </w:r>
+          </w:p>
+        </w:tc>
+      </w:tr>
+      <w:tr>
+        <w:trPr>
+          <w:cantSplit/>
+        </w:trPr>
+        <w:tc>
+          <w:tcPr>
+            <w:tcW w:type="dxa" w:w="2268"/>
+            <w:vAlign w:val="center"/>
+            <w:tcMar>
+              <w:top w:w="70" w:type="dxa"/>
+              <w:left w:w="70" w:type="dxa"/>
+              <w:bottom w:w="70" w:type="dxa"/>
+              <w:right w:w="70" w:type="dxa"/>
+            </w:tcMar>
+            <w:shd w:fill="FFFFFF"/>
+          </w:tcPr>
+          <w:p>
+            <w:pPr>
+              <w:spacing w:after="0" w:line="252" w:lineRule="auto"/>
+            </w:pPr>
+            <w:r>
+              <w:rPr>
+                <w:b w:val="0"/>
+                <w:sz w:val="19"/>
+              </w:rPr>
+              <w:t>实验操作与气体制取</w:t>
             </w:r>
           </w:p>
         </w:tc>
         <w:tc>
           <w:tcPr>
-            <w:tcW w:type="dxa" w:w="2466"/>
+            <w:tcW w:type="dxa" w:w="3969"/>
+            <w:vAlign w:val="center"/>
+            <w:tcMar>
+              <w:top w:w="70" w:type="dxa"/>
+              <w:left w:w="70" w:type="dxa"/>
+              <w:bottom w:w="70" w:type="dxa"/>
+              <w:right w:w="70" w:type="dxa"/>
+            </w:tcMar>
+            <w:shd w:fill="FFFFFF"/>
           </w:tcPr>
           <w:p>
             <w:pPr>
-              <w:spacing w:after="20"/>
+              <w:spacing w:after="0" w:line="252" w:lineRule="auto"/>
             </w:pPr>
             <w:r>
               <w:rPr>
-                <w:rFonts w:ascii="Times New Roman" w:hAnsi="Times New Roman" w:eastAsia="宋体"/>
                 <w:b w:val="0"/>
-                <w:sz w:val="21"/>
+                <w:sz w:val="19"/>
               </w:rPr>
-              <w:t>前 10 道单选、后 5 道多选</w:t>
+              <w:t>装置选择和操作次序</w:t>
+            </w:r>
+          </w:p>
+        </w:tc>
+        <w:tc>
+          <w:tcPr>
+            <w:tcW w:type="dxa" w:w="3969"/>
+            <w:vAlign w:val="center"/>
+            <w:tcMar>
+              <w:top w:w="70" w:type="dxa"/>
+              <w:left w:w="70" w:type="dxa"/>
+              <w:bottom w:w="70" w:type="dxa"/>
+              <w:right w:w="70" w:type="dxa"/>
+            </w:tcMar>
+            <w:shd w:fill="FFFFFF"/>
+          </w:tcPr>
+          <w:p>
+            <w:pPr>
+              <w:spacing w:after="0" w:line="252" w:lineRule="auto"/>
+            </w:pPr>
+            <w:r>
+              <w:rPr>
+                <w:b w:val="0"/>
+                <w:sz w:val="19"/>
+              </w:rPr>
+              <w:t>说明选择依据，区分现象与结论</w:t>
             </w:r>
           </w:p>
         </w:tc>
       </w:tr>
       <w:tr>
+        <w:trPr>
+          <w:cantSplit/>
+        </w:trPr>
         <w:tc>
           <w:tcPr>
-            <w:tcW w:type="dxa" w:w="2466"/>
+            <w:tcW w:type="dxa" w:w="2268"/>
+            <w:vAlign w:val="center"/>
+            <w:tcMar>
+              <w:top w:w="70" w:type="dxa"/>
+              <w:left w:w="70" w:type="dxa"/>
+              <w:bottom w:w="70" w:type="dxa"/>
+              <w:right w:w="70" w:type="dxa"/>
+            </w:tcMar>
+            <w:shd w:fill="F7F8FA"/>
           </w:tcPr>
           <w:p>
             <w:pPr>
-              <w:spacing w:after="20"/>
+              <w:spacing w:after="0" w:line="252" w:lineRule="auto"/>
             </w:pPr>
             <w:r>
               <w:rPr>
-                <w:rFonts w:ascii="Times New Roman" w:hAnsi="Times New Roman" w:eastAsia="宋体"/>
                 <w:b w:val="0"/>
-                <w:sz w:val="21"/>
+                <w:sz w:val="19"/>
               </w:rPr>
-              <w:t>非选择题</w:t>
+              <w:t>化学式与溶液计算</w:t>
             </w:r>
           </w:p>
         </w:tc>
         <w:tc>
           <w:tcPr>
-            <w:tcW w:type="dxa" w:w="2466"/>
+            <w:tcW w:type="dxa" w:w="3969"/>
+            <w:vAlign w:val="center"/>
+            <w:tcMar>
+              <w:top w:w="70" w:type="dxa"/>
+              <w:left w:w="70" w:type="dxa"/>
+              <w:bottom w:w="70" w:type="dxa"/>
+              <w:right w:w="70" w:type="dxa"/>
+            </w:tcMar>
+            <w:shd w:fill="F7F8FA"/>
           </w:tcPr>
           <w:p>
             <w:pPr>
-              <w:spacing w:after="20"/>
+              <w:spacing w:after="0" w:line="252" w:lineRule="auto"/>
             </w:pPr>
             <w:r>
               <w:rPr>
-                <w:rFonts w:ascii="Times New Roman" w:hAnsi="Times New Roman" w:eastAsia="宋体"/>
                 <w:b w:val="0"/>
-                <w:sz w:val="21"/>
+                <w:sz w:val="19"/>
               </w:rPr>
-              <w:t>11 道</w:t>
+              <w:t>质量比、质量分数及守恒</w:t>
             </w:r>
           </w:p>
         </w:tc>
         <w:tc>
           <w:tcPr>
-            <w:tcW w:type="dxa" w:w="2466"/>
+            <w:tcW w:type="dxa" w:w="3969"/>
+            <w:vAlign w:val="center"/>
+            <w:tcMar>
+              <w:top w:w="70" w:type="dxa"/>
+              <w:left w:w="70" w:type="dxa"/>
+              <w:bottom w:w="70" w:type="dxa"/>
+              <w:right w:w="70" w:type="dxa"/>
+            </w:tcMar>
+            <w:shd w:fill="F7F8FA"/>
           </w:tcPr>
           <w:p>
             <w:pPr>
-              <w:spacing w:after="20"/>
+              <w:spacing w:after="0" w:line="252" w:lineRule="auto"/>
             </w:pPr>
             <w:r>
               <w:rPr>
-                <w:rFonts w:ascii="Times New Roman" w:hAnsi="Times New Roman" w:eastAsia="宋体"/>
                 <w:b w:val="0"/>
-                <w:sz w:val="21"/>
+                <w:sz w:val="19"/>
               </w:rPr>
-              <w:t>共 70 分</w:t>
-            </w:r>
-          </w:p>
-        </w:tc>
-        <w:tc>
-          <w:tcPr>
-            <w:tcW w:type="dxa" w:w="2466"/>
-          </w:tcPr>
-          <w:p>
-            <w:pPr>
-              <w:spacing w:after="20"/>
-            </w:pPr>
-            <w:r>
-              <w:rPr>
-                <w:rFonts w:ascii="Times New Roman" w:hAnsi="Times New Roman" w:eastAsia="宋体"/>
-                <w:b w:val="0"/>
-                <w:sz w:val="21"/>
-              </w:rPr>
-              <w:t>含填空、简答、实验、计算，要写过程</w:t>
+              <w:t>列关系式、标单位、核对结果范围</w:t>
             </w:r>
           </w:p>
         </w:tc>
       </w:tr>
     </w:tbl>
     <w:p>
+      <w:pPr>
+        <w:spacing w:after="40"/>
+      </w:pPr>
+    </w:p>
+    <w:p>
+      <w:pPr>
+        <w:pStyle w:val="Heading1"/>
+      </w:pPr>
       <w:r>
-        <w:rPr>
-          <w:rFonts w:ascii="Times New Roman" w:hAnsi="Times New Roman" w:eastAsia="宋体"/>
-          <w:b w:val="0"/>
-          <w:sz w:val="23"/>
-        </w:rPr>
-        <w:t>化学知识点碎、要记的内容多，但套路非常固定，是理科里靠“记熟、练熟”就能较快提分的一科，基础薄弱的孩子也完全能学好。</w:t>
+        <w:t>三 综合题逐步练</w:t>
+      </w:r>
+    </w:p>
+    <w:p>
+      <w:r>
+        <w:t>酸碱盐推断、物质转化、金属活动性和综合计算，可以先列出已知现象与反应，再逐步建立数量关系。实验题的分值与题号必须对照具体试卷。</w:t>
+      </w:r>
+    </w:p>
+    <w:p>
+      <w:r>
+        <w:t>先让孩子独立读题、说出条件，完成能解释依据的小问；遇到卡点，再回到对应基础知识。练习后检查中间步骤，不只看最后答案。</w:t>
       </w:r>
     </w:p>
     <w:p>
       <w:pPr>
-        <w:shd w:val="clear" w:fill="DEEBF7"/>
-        <w:spacing w:before="240" w:after="100"/>
+        <w:pStyle w:val="Heading1"/>
       </w:pPr>
       <w:r>
-        <w:rPr>
-          <w:rFonts w:ascii="Times New Roman" w:hAnsi="Times New Roman" w:eastAsia="黑体"/>
-          <w:b/>
-          <w:color w:val="1F3A5F"/>
-          <w:sz w:val="27"/>
-        </w:rPr>
-        <w:t>二、哪些分一定要拿到（基础盘，约 60 分）</w:t>
+        <w:t>四 历年规律仍待核实</w:t>
       </w:r>
     </w:p>
-    <w:tbl>
-      <w:tblPr>
-        <w:tblStyle w:val="TableGrid"/>
-        <w:tblW w:type="auto" w:w="0"/>
-        <w:tblLook w:firstColumn="1" w:firstRow="1" w:lastColumn="0" w:lastRow="0" w:noHBand="0" w:noVBand="1" w:val="04A0"/>
-      </w:tblPr>
-      <w:tblGrid>
-        <w:gridCol w:w="2466"/>
-        <w:gridCol w:w="2466"/>
-        <w:gridCol w:w="2466"/>
-        <w:gridCol w:w="2466"/>
-      </w:tblGrid>
-      <w:tr>
-        <w:trPr>
-          <w:tblHeader w:val="true"/>
-        </w:trPr>
-        <w:tc>
-          <w:tcPr>
-            <w:tcW w:type="dxa" w:w="2466"/>
-            <w:shd w:val="clear" w:fill="1F4E79"/>
-          </w:tcPr>
-          <w:p>
-            <w:pPr>
-              <w:spacing w:after="20"/>
-            </w:pPr>
-            <w:r/>
-            <w:r>
-              <w:rPr>
-                <w:rFonts w:ascii="Times New Roman" w:hAnsi="Times New Roman" w:eastAsia="黑体"/>
-                <w:b/>
-                <w:color w:val="FFFFFF"/>
-                <w:sz w:val="21"/>
-              </w:rPr>
-              <w:t>位置</w:t>
-            </w:r>
-          </w:p>
-        </w:tc>
-        <w:tc>
-          <w:tcPr>
-            <w:tcW w:type="dxa" w:w="2466"/>
-            <w:shd w:val="clear" w:fill="1F4E79"/>
-          </w:tcPr>
-          <w:p>
-            <w:pPr>
-              <w:spacing w:after="20"/>
-            </w:pPr>
-            <w:r/>
-            <w:r>
-              <w:rPr>
-                <w:rFonts w:ascii="Times New Roman" w:hAnsi="Times New Roman" w:eastAsia="黑体"/>
-                <w:b/>
-                <w:color w:val="FFFFFF"/>
-                <w:sz w:val="21"/>
-              </w:rPr>
-              <w:t>考什么</w:t>
-            </w:r>
-          </w:p>
-        </w:tc>
-        <w:tc>
-          <w:tcPr>
-            <w:tcW w:type="dxa" w:w="2466"/>
-            <w:shd w:val="clear" w:fill="1F4E79"/>
-          </w:tcPr>
-          <w:p>
-            <w:pPr>
-              <w:spacing w:after="20"/>
-            </w:pPr>
-            <w:r/>
-            <w:r>
-              <w:rPr>
-                <w:rFonts w:ascii="Times New Roman" w:hAnsi="Times New Roman" w:eastAsia="黑体"/>
-                <w:b/>
-                <w:color w:val="FFFFFF"/>
-                <w:sz w:val="21"/>
-              </w:rPr>
-              <w:t>分值</w:t>
-            </w:r>
-          </w:p>
-        </w:tc>
-        <w:tc>
-          <w:tcPr>
-            <w:tcW w:type="dxa" w:w="2466"/>
-            <w:shd w:val="clear" w:fill="1F4E79"/>
-          </w:tcPr>
-          <w:p>
-            <w:pPr>
-              <w:spacing w:after="20"/>
-            </w:pPr>
-            <w:r/>
-            <w:r>
-              <w:rPr>
-                <w:rFonts w:ascii="Times New Roman" w:hAnsi="Times New Roman" w:eastAsia="黑体"/>
-                <w:b/>
-                <w:color w:val="FFFFFF"/>
-                <w:sz w:val="21"/>
-              </w:rPr>
-              <w:t>说明</w:t>
-            </w:r>
-          </w:p>
-        </w:tc>
-      </w:tr>
-      <w:tr>
-        <w:tc>
-          <w:tcPr>
-            <w:tcW w:type="dxa" w:w="2466"/>
-          </w:tcPr>
-          <w:p>
-            <w:pPr>
-              <w:spacing w:after="20"/>
-            </w:pPr>
-            <w:r>
-              <w:rPr>
-                <w:rFonts w:ascii="Times New Roman" w:hAnsi="Times New Roman" w:eastAsia="宋体"/>
-                <w:b w:val="0"/>
-                <w:sz w:val="21"/>
-              </w:rPr>
-              <w:t>选择第 1—7 题</w:t>
-            </w:r>
-          </w:p>
-        </w:tc>
-        <w:tc>
-          <w:tcPr>
-            <w:tcW w:type="dxa" w:w="2466"/>
-          </w:tcPr>
-          <w:p>
-            <w:pPr>
-              <w:spacing w:after="20"/>
-            </w:pPr>
-            <w:r>
-              <w:rPr>
-                <w:rFonts w:ascii="Times New Roman" w:hAnsi="Times New Roman" w:eastAsia="宋体"/>
-                <w:b w:val="0"/>
-                <w:sz w:val="21"/>
-              </w:rPr>
-              <w:t>物质变化、空气、元素、分类、营养素、酸碱度、基本操作</w:t>
-            </w:r>
-          </w:p>
-        </w:tc>
-        <w:tc>
-          <w:tcPr>
-            <w:tcW w:type="dxa" w:w="2466"/>
-          </w:tcPr>
-          <w:p>
-            <w:pPr>
-              <w:spacing w:after="20"/>
-            </w:pPr>
-            <w:r>
-              <w:rPr>
-                <w:rFonts w:ascii="Times New Roman" w:hAnsi="Times New Roman" w:eastAsia="宋体"/>
-                <w:b w:val="0"/>
-                <w:sz w:val="21"/>
-              </w:rPr>
-              <w:t>每题 2 分</w:t>
-            </w:r>
-          </w:p>
-        </w:tc>
-        <w:tc>
-          <w:tcPr>
-            <w:tcW w:type="dxa" w:w="2466"/>
-          </w:tcPr>
-          <w:p>
-            <w:pPr>
-              <w:spacing w:after="20"/>
-            </w:pPr>
-            <w:r>
-              <w:rPr>
-                <w:rFonts w:ascii="Times New Roman" w:hAnsi="Times New Roman" w:eastAsia="宋体"/>
-                <w:b w:val="0"/>
-                <w:sz w:val="21"/>
-              </w:rPr>
-              <w:t>全是基础固定考点</w:t>
-            </w:r>
-          </w:p>
-        </w:tc>
-      </w:tr>
-      <w:tr>
-        <w:tc>
-          <w:tcPr>
-            <w:tcW w:type="dxa" w:w="2466"/>
-          </w:tcPr>
-          <w:p>
-            <w:pPr>
-              <w:spacing w:after="20"/>
-            </w:pPr>
-            <w:r>
-              <w:rPr>
-                <w:rFonts w:ascii="Times New Roman" w:hAnsi="Times New Roman" w:eastAsia="宋体"/>
-                <w:b w:val="0"/>
-                <w:sz w:val="21"/>
-              </w:rPr>
-              <w:t>填空第 16 题</w:t>
-            </w:r>
-          </w:p>
-        </w:tc>
-        <w:tc>
-          <w:tcPr>
-            <w:tcW w:type="dxa" w:w="2466"/>
-          </w:tcPr>
-          <w:p>
-            <w:pPr>
-              <w:spacing w:after="20"/>
-            </w:pPr>
-            <w:r>
-              <w:rPr>
-                <w:rFonts w:ascii="Times New Roman" w:hAnsi="Times New Roman" w:eastAsia="宋体"/>
-                <w:b w:val="0"/>
-                <w:sz w:val="21"/>
-              </w:rPr>
-              <w:t>常见物质的用途对号入座</w:t>
-            </w:r>
-          </w:p>
-        </w:tc>
-        <w:tc>
-          <w:tcPr>
-            <w:tcW w:type="dxa" w:w="2466"/>
-          </w:tcPr>
-          <w:p>
-            <w:pPr>
-              <w:spacing w:after="20"/>
-            </w:pPr>
-            <w:r>
-              <w:rPr>
-                <w:rFonts w:ascii="Times New Roman" w:hAnsi="Times New Roman" w:eastAsia="宋体"/>
-                <w:b w:val="0"/>
-                <w:sz w:val="21"/>
-              </w:rPr>
-              <w:t>约 4—6 分</w:t>
-            </w:r>
-          </w:p>
-        </w:tc>
-        <w:tc>
-          <w:tcPr>
-            <w:tcW w:type="dxa" w:w="2466"/>
-          </w:tcPr>
-          <w:p>
-            <w:pPr>
-              <w:spacing w:after="20"/>
-            </w:pPr>
-            <w:r>
-              <w:rPr>
-                <w:rFonts w:ascii="Times New Roman" w:hAnsi="Times New Roman" w:eastAsia="宋体"/>
-                <w:b w:val="0"/>
-                <w:sz w:val="21"/>
-              </w:rPr>
-              <w:t>题型年年不变</w:t>
-            </w:r>
-          </w:p>
-        </w:tc>
-      </w:tr>
-      <w:tr>
-        <w:tc>
-          <w:tcPr>
-            <w:tcW w:type="dxa" w:w="2466"/>
-          </w:tcPr>
-          <w:p>
-            <w:pPr>
-              <w:spacing w:after="20"/>
-            </w:pPr>
-            <w:r>
-              <w:rPr>
-                <w:rFonts w:ascii="Times New Roman" w:hAnsi="Times New Roman" w:eastAsia="宋体"/>
-                <w:b w:val="0"/>
-                <w:sz w:val="21"/>
-              </w:rPr>
-              <w:t>填空第 17 题</w:t>
-            </w:r>
-          </w:p>
-        </w:tc>
-        <w:tc>
-          <w:tcPr>
-            <w:tcW w:type="dxa" w:w="2466"/>
-          </w:tcPr>
-          <w:p>
-            <w:pPr>
-              <w:spacing w:after="20"/>
-            </w:pPr>
-            <w:r>
-              <w:rPr>
-                <w:rFonts w:ascii="Times New Roman" w:hAnsi="Times New Roman" w:eastAsia="宋体"/>
-                <w:b w:val="0"/>
-                <w:sz w:val="21"/>
-              </w:rPr>
-              <w:t>水（净水、电解水）</w:t>
-            </w:r>
-          </w:p>
-        </w:tc>
-        <w:tc>
-          <w:tcPr>
-            <w:tcW w:type="dxa" w:w="2466"/>
-          </w:tcPr>
-          <w:p>
-            <w:pPr>
-              <w:spacing w:after="20"/>
-            </w:pPr>
-            <w:r>
-              <w:rPr>
-                <w:rFonts w:ascii="Times New Roman" w:hAnsi="Times New Roman" w:eastAsia="宋体"/>
-                <w:b w:val="0"/>
-                <w:sz w:val="21"/>
-              </w:rPr>
-              <w:t>约 7 分</w:t>
-            </w:r>
-          </w:p>
-        </w:tc>
-        <w:tc>
-          <w:tcPr>
-            <w:tcW w:type="dxa" w:w="2466"/>
-          </w:tcPr>
-          <w:p>
-            <w:pPr>
-              <w:spacing w:after="20"/>
-            </w:pPr>
-            <w:r>
-              <w:rPr>
-                <w:rFonts w:ascii="Times New Roman" w:hAnsi="Times New Roman" w:eastAsia="宋体"/>
-                <w:b w:val="0"/>
-                <w:sz w:val="21"/>
-              </w:rPr>
-              <w:t>固定考点</w:t>
-            </w:r>
-          </w:p>
-        </w:tc>
-      </w:tr>
-      <w:tr>
-        <w:tc>
-          <w:tcPr>
-            <w:tcW w:type="dxa" w:w="2466"/>
-          </w:tcPr>
-          <w:p>
-            <w:pPr>
-              <w:spacing w:after="20"/>
-            </w:pPr>
-            <w:r>
-              <w:rPr>
-                <w:rFonts w:ascii="Times New Roman" w:hAnsi="Times New Roman" w:eastAsia="宋体"/>
-                <w:b w:val="0"/>
-                <w:sz w:val="21"/>
-              </w:rPr>
-              <w:t>简答第 19 题</w:t>
-            </w:r>
-          </w:p>
-        </w:tc>
-        <w:tc>
-          <w:tcPr>
-            <w:tcW w:type="dxa" w:w="2466"/>
-          </w:tcPr>
-          <w:p>
-            <w:pPr>
-              <w:spacing w:after="20"/>
-            </w:pPr>
-            <w:r>
-              <w:rPr>
-                <w:rFonts w:ascii="Times New Roman" w:hAnsi="Times New Roman" w:eastAsia="宋体"/>
-                <w:b w:val="0"/>
-                <w:sz w:val="21"/>
-              </w:rPr>
-              <w:t>书写三个化学方程式</w:t>
-            </w:r>
-          </w:p>
-        </w:tc>
-        <w:tc>
-          <w:tcPr>
-            <w:tcW w:type="dxa" w:w="2466"/>
-          </w:tcPr>
-          <w:p>
-            <w:pPr>
-              <w:spacing w:after="20"/>
-            </w:pPr>
-            <w:r>
-              <w:rPr>
-                <w:rFonts w:ascii="Times New Roman" w:hAnsi="Times New Roman" w:eastAsia="宋体"/>
-                <w:b w:val="0"/>
-                <w:sz w:val="21"/>
-              </w:rPr>
-              <w:t>6 分</w:t>
-            </w:r>
-          </w:p>
-        </w:tc>
-        <w:tc>
-          <w:tcPr>
-            <w:tcW w:type="dxa" w:w="2466"/>
-          </w:tcPr>
-          <w:p>
-            <w:pPr>
-              <w:spacing w:after="20"/>
-            </w:pPr>
-            <w:r>
-              <w:rPr>
-                <w:rFonts w:ascii="Times New Roman" w:hAnsi="Times New Roman" w:eastAsia="宋体"/>
-                <w:b w:val="0"/>
-                <w:sz w:val="21"/>
-              </w:rPr>
-              <w:t>把常考方程式背熟即得分</w:t>
-            </w:r>
-          </w:p>
-        </w:tc>
-      </w:tr>
-      <w:tr>
-        <w:tc>
-          <w:tcPr>
-            <w:tcW w:type="dxa" w:w="2466"/>
-          </w:tcPr>
-          <w:p>
-            <w:pPr>
-              <w:spacing w:after="20"/>
-            </w:pPr>
-            <w:r>
-              <w:rPr>
-                <w:rFonts w:ascii="Times New Roman" w:hAnsi="Times New Roman" w:eastAsia="宋体"/>
-                <w:b w:val="0"/>
-                <w:sz w:val="21"/>
-              </w:rPr>
-              <w:t>计算第 25 题</w:t>
-            </w:r>
-          </w:p>
-        </w:tc>
-        <w:tc>
-          <w:tcPr>
-            <w:tcW w:type="dxa" w:w="2466"/>
-          </w:tcPr>
-          <w:p>
-            <w:pPr>
-              <w:spacing w:after="20"/>
-            </w:pPr>
-            <w:r>
-              <w:rPr>
-                <w:rFonts w:ascii="Times New Roman" w:hAnsi="Times New Roman" w:eastAsia="宋体"/>
-                <w:b w:val="0"/>
-                <w:sz w:val="21"/>
-              </w:rPr>
-              <w:t>化学式计算（相对分子质量、元素质量比）</w:t>
-            </w:r>
-          </w:p>
-        </w:tc>
-        <w:tc>
-          <w:tcPr>
-            <w:tcW w:type="dxa" w:w="2466"/>
-          </w:tcPr>
-          <w:p>
-            <w:pPr>
-              <w:spacing w:after="20"/>
-            </w:pPr>
-            <w:r>
-              <w:rPr>
-                <w:rFonts w:ascii="Times New Roman" w:hAnsi="Times New Roman" w:eastAsia="宋体"/>
-                <w:b w:val="0"/>
-                <w:sz w:val="21"/>
-              </w:rPr>
-              <w:t>3—4 分</w:t>
-            </w:r>
-          </w:p>
-        </w:tc>
-        <w:tc>
-          <w:tcPr>
-            <w:tcW w:type="dxa" w:w="2466"/>
-          </w:tcPr>
-          <w:p>
-            <w:pPr>
-              <w:spacing w:after="20"/>
-            </w:pPr>
-            <w:r>
-              <w:rPr>
-                <w:rFonts w:ascii="Times New Roman" w:hAnsi="Times New Roman" w:eastAsia="宋体"/>
-                <w:b w:val="0"/>
-                <w:sz w:val="21"/>
-              </w:rPr>
-              <w:t>每年换新物质，纯套公式</w:t>
-            </w:r>
-          </w:p>
-        </w:tc>
-      </w:tr>
-      <w:tr>
-        <w:tc>
-          <w:tcPr>
-            <w:tcW w:type="dxa" w:w="2466"/>
-          </w:tcPr>
-          <w:p>
-            <w:pPr>
-              <w:spacing w:after="20"/>
-            </w:pPr>
-            <w:r>
-              <w:rPr>
-                <w:rFonts w:ascii="Times New Roman" w:hAnsi="Times New Roman" w:eastAsia="宋体"/>
-                <w:b w:val="0"/>
-                <w:sz w:val="21"/>
-              </w:rPr>
-              <w:t>实验第 22 题前两问</w:t>
-            </w:r>
-          </w:p>
-        </w:tc>
-        <w:tc>
-          <w:tcPr>
-            <w:tcW w:type="dxa" w:w="2466"/>
-          </w:tcPr>
-          <w:p>
-            <w:pPr>
-              <w:spacing w:after="20"/>
-            </w:pPr>
-            <w:r>
-              <w:rPr>
-                <w:rFonts w:ascii="Times New Roman" w:hAnsi="Times New Roman" w:eastAsia="宋体"/>
-                <w:b w:val="0"/>
-                <w:sz w:val="21"/>
-              </w:rPr>
-              <w:t>氧气、二氧化碳的制取</w:t>
-            </w:r>
-          </w:p>
-        </w:tc>
-        <w:tc>
-          <w:tcPr>
-            <w:tcW w:type="dxa" w:w="2466"/>
-          </w:tcPr>
-          <w:p>
-            <w:pPr>
-              <w:spacing w:after="20"/>
-            </w:pPr>
-            <w:r>
-              <w:rPr>
-                <w:rFonts w:ascii="Times New Roman" w:hAnsi="Times New Roman" w:eastAsia="宋体"/>
-                <w:b w:val="0"/>
-                <w:sz w:val="21"/>
-              </w:rPr>
-              <w:t>约 4 分</w:t>
-            </w:r>
-          </w:p>
-        </w:tc>
-        <w:tc>
-          <w:tcPr>
-            <w:tcW w:type="dxa" w:w="2466"/>
-          </w:tcPr>
-          <w:p>
-            <w:pPr>
-              <w:spacing w:after="20"/>
-            </w:pPr>
-            <w:r>
-              <w:rPr>
-                <w:rFonts w:ascii="Times New Roman" w:hAnsi="Times New Roman" w:eastAsia="宋体"/>
-                <w:b w:val="0"/>
-                <w:sz w:val="21"/>
-              </w:rPr>
-              <w:t>装置和方程式固定</w:t>
-            </w:r>
-          </w:p>
-        </w:tc>
-      </w:tr>
-    </w:tbl>
     <w:p>
       <w:r>
-        <w:rPr>
-          <w:rFonts w:ascii="Times New Roman" w:hAnsi="Times New Roman" w:eastAsia="宋体"/>
-          <w:b w:val="0"/>
-          <w:sz w:val="23"/>
-        </w:rPr>
-        <w:t>计算第 25 题每年只是换个新物质的名字（2026 年是青蒿素），做法完全一样，是标准的送分题。</w:t>
+        <w:t>旧资料中，2024年单选第1至10题的考点按答案和历年规律反推，不能用于确定频次。旧“基础盘约60分”列项实际合计42分，后续分组又重复计入部分题目，因此撤销60/30/10分分组。</w:t>
+      </w:r>
+    </w:p>
+    <w:p>
+      <w:r>
+        <w:t>目前保留的候选记录，不等于已确认的真题事实。以后只有补齐题面、答案、来源定位和核验日期，才能重新统计频次；“尚未核实”也不代表这个考点没有考过。</w:t>
       </w:r>
     </w:p>
     <w:p>
       <w:pPr>
-        <w:shd w:val="clear" w:fill="DEEBF7"/>
-        <w:spacing w:before="240" w:after="100"/>
+        <w:pStyle w:val="Heading1"/>
       </w:pPr>
       <w:r>
-        <w:rPr>
-          <w:rFonts w:ascii="Times New Roman" w:hAnsi="Times New Roman" w:eastAsia="黑体"/>
-          <w:b/>
-          <w:color w:val="1F3A5F"/>
-          <w:sz w:val="27"/>
-        </w:rPr>
-        <w:t>三、哪些题用来拉开差距（量力而行）</w:t>
-      </w:r>
-    </w:p>
-    <w:tbl>
-      <w:tblPr>
-        <w:tblStyle w:val="TableGrid"/>
-        <w:tblW w:type="auto" w:w="0"/>
-        <w:tblLook w:firstColumn="1" w:firstRow="1" w:lastColumn="0" w:lastRow="0" w:noHBand="0" w:noVBand="1" w:val="04A0"/>
-      </w:tblPr>
-      <w:tblGrid>
-        <w:gridCol w:w="2466"/>
-        <w:gridCol w:w="2466"/>
-        <w:gridCol w:w="2466"/>
-        <w:gridCol w:w="2466"/>
-      </w:tblGrid>
-      <w:tr>
-        <w:trPr>
-          <w:tblHeader w:val="true"/>
-        </w:trPr>
-        <w:tc>
-          <w:tcPr>
-            <w:tcW w:type="dxa" w:w="2466"/>
-            <w:shd w:val="clear" w:fill="1F4E79"/>
-          </w:tcPr>
-          <w:p>
-            <w:pPr>
-              <w:spacing w:after="20"/>
-            </w:pPr>
-            <w:r/>
-            <w:r>
-              <w:rPr>
-                <w:rFonts w:ascii="Times New Roman" w:hAnsi="Times New Roman" w:eastAsia="黑体"/>
-                <w:b/>
-                <w:color w:val="FFFFFF"/>
-                <w:sz w:val="21"/>
-              </w:rPr>
-              <w:t>位置</w:t>
-            </w:r>
-          </w:p>
-        </w:tc>
-        <w:tc>
-          <w:tcPr>
-            <w:tcW w:type="dxa" w:w="2466"/>
-            <w:shd w:val="clear" w:fill="1F4E79"/>
-          </w:tcPr>
-          <w:p>
-            <w:pPr>
-              <w:spacing w:after="20"/>
-            </w:pPr>
-            <w:r/>
-            <w:r>
-              <w:rPr>
-                <w:rFonts w:ascii="Times New Roman" w:hAnsi="Times New Roman" w:eastAsia="黑体"/>
-                <w:b/>
-                <w:color w:val="FFFFFF"/>
-                <w:sz w:val="21"/>
-              </w:rPr>
-              <w:t>考什么</w:t>
-            </w:r>
-          </w:p>
-        </w:tc>
-        <w:tc>
-          <w:tcPr>
-            <w:tcW w:type="dxa" w:w="2466"/>
-            <w:shd w:val="clear" w:fill="1F4E79"/>
-          </w:tcPr>
-          <w:p>
-            <w:pPr>
-              <w:spacing w:after="20"/>
-            </w:pPr>
-            <w:r/>
-            <w:r>
-              <w:rPr>
-                <w:rFonts w:ascii="Times New Roman" w:hAnsi="Times New Roman" w:eastAsia="黑体"/>
-                <w:b/>
-                <w:color w:val="FFFFFF"/>
-                <w:sz w:val="21"/>
-              </w:rPr>
-              <w:t>分值</w:t>
-            </w:r>
-          </w:p>
-        </w:tc>
-        <w:tc>
-          <w:tcPr>
-            <w:tcW w:type="dxa" w:w="2466"/>
-            <w:shd w:val="clear" w:fill="1F4E79"/>
-          </w:tcPr>
-          <w:p>
-            <w:pPr>
-              <w:spacing w:after="20"/>
-            </w:pPr>
-            <w:r/>
-            <w:r>
-              <w:rPr>
-                <w:rFonts w:ascii="Times New Roman" w:hAnsi="Times New Roman" w:eastAsia="黑体"/>
-                <w:b/>
-                <w:color w:val="FFFFFF"/>
-                <w:sz w:val="21"/>
-              </w:rPr>
-              <w:t>建议</w:t>
-            </w:r>
-          </w:p>
-        </w:tc>
-      </w:tr>
-      <w:tr>
-        <w:tc>
-          <w:tcPr>
-            <w:tcW w:type="dxa" w:w="2466"/>
-          </w:tcPr>
-          <w:p>
-            <w:pPr>
-              <w:spacing w:after="20"/>
-            </w:pPr>
-            <w:r>
-              <w:rPr>
-                <w:rFonts w:ascii="Times New Roman" w:hAnsi="Times New Roman" w:eastAsia="宋体"/>
-                <w:b w:val="0"/>
-                <w:sz w:val="21"/>
-              </w:rPr>
-              <w:t>多选第 14、15 题</w:t>
-            </w:r>
-          </w:p>
-        </w:tc>
-        <w:tc>
-          <w:tcPr>
-            <w:tcW w:type="dxa" w:w="2466"/>
-          </w:tcPr>
-          <w:p>
-            <w:pPr>
-              <w:spacing w:after="20"/>
-            </w:pPr>
-            <w:r>
-              <w:rPr>
-                <w:rFonts w:ascii="Times New Roman" w:hAnsi="Times New Roman" w:eastAsia="宋体"/>
-                <w:b w:val="0"/>
-                <w:sz w:val="21"/>
-              </w:rPr>
-              <w:t>物质转化关系、综合计算判断</w:t>
-            </w:r>
-          </w:p>
-        </w:tc>
-        <w:tc>
-          <w:tcPr>
-            <w:tcW w:type="dxa" w:w="2466"/>
-          </w:tcPr>
-          <w:p>
-            <w:pPr>
-              <w:spacing w:after="20"/>
-            </w:pPr>
-            <w:r>
-              <w:rPr>
-                <w:rFonts w:ascii="Times New Roman" w:hAnsi="Times New Roman" w:eastAsia="宋体"/>
-                <w:b w:val="0"/>
-                <w:sz w:val="21"/>
-              </w:rPr>
-              <w:t>每题 2 分</w:t>
-            </w:r>
-          </w:p>
-        </w:tc>
-        <w:tc>
-          <w:tcPr>
-            <w:tcW w:type="dxa" w:w="2466"/>
-          </w:tcPr>
-          <w:p>
-            <w:pPr>
-              <w:spacing w:after="20"/>
-            </w:pPr>
-            <w:r>
-              <w:rPr>
-                <w:rFonts w:ascii="Times New Roman" w:hAnsi="Times New Roman" w:eastAsia="宋体"/>
-                <w:b w:val="0"/>
-                <w:sz w:val="21"/>
-              </w:rPr>
-              <w:t>选择题里最难，谨慎选</w:t>
-            </w:r>
-          </w:p>
-        </w:tc>
-      </w:tr>
-      <w:tr>
-        <w:tc>
-          <w:tcPr>
-            <w:tcW w:type="dxa" w:w="2466"/>
-          </w:tcPr>
-          <w:p>
-            <w:pPr>
-              <w:spacing w:after="20"/>
-            </w:pPr>
-            <w:r>
-              <w:rPr>
-                <w:rFonts w:ascii="Times New Roman" w:hAnsi="Times New Roman" w:eastAsia="宋体"/>
-                <w:b w:val="0"/>
-                <w:sz w:val="21"/>
-              </w:rPr>
-              <w:t>实验第 23 题</w:t>
-            </w:r>
-          </w:p>
-        </w:tc>
-        <w:tc>
-          <w:tcPr>
-            <w:tcW w:type="dxa" w:w="2466"/>
-          </w:tcPr>
-          <w:p>
-            <w:pPr>
-              <w:spacing w:after="20"/>
-            </w:pPr>
-            <w:r>
-              <w:rPr>
-                <w:rFonts w:ascii="Times New Roman" w:hAnsi="Times New Roman" w:eastAsia="宋体"/>
-                <w:b w:val="0"/>
-                <w:sz w:val="21"/>
-              </w:rPr>
-              <w:t>酸碱盐性质、实验探究</w:t>
-            </w:r>
-          </w:p>
-        </w:tc>
-        <w:tc>
-          <w:tcPr>
-            <w:tcW w:type="dxa" w:w="2466"/>
-          </w:tcPr>
-          <w:p>
-            <w:pPr>
-              <w:spacing w:after="20"/>
-            </w:pPr>
-            <w:r>
-              <w:rPr>
-                <w:rFonts w:ascii="Times New Roman" w:hAnsi="Times New Roman" w:eastAsia="宋体"/>
-                <w:b w:val="0"/>
-                <w:sz w:val="21"/>
-              </w:rPr>
-              <w:t>约 7—8 分</w:t>
-            </w:r>
-          </w:p>
-        </w:tc>
-        <w:tc>
-          <w:tcPr>
-            <w:tcW w:type="dxa" w:w="2466"/>
-          </w:tcPr>
-          <w:p>
-            <w:pPr>
-              <w:spacing w:after="20"/>
-            </w:pPr>
-            <w:r>
-              <w:rPr>
-                <w:rFonts w:ascii="Times New Roman" w:hAnsi="Times New Roman" w:eastAsia="宋体"/>
-                <w:b w:val="0"/>
-                <w:sz w:val="21"/>
-              </w:rPr>
-              <w:t>综合性强</w:t>
-            </w:r>
-          </w:p>
-        </w:tc>
-      </w:tr>
-      <w:tr>
-        <w:tc>
-          <w:tcPr>
-            <w:tcW w:type="dxa" w:w="2466"/>
-          </w:tcPr>
-          <w:p>
-            <w:pPr>
-              <w:spacing w:after="20"/>
-            </w:pPr>
-            <w:r>
-              <w:rPr>
-                <w:rFonts w:ascii="Times New Roman" w:hAnsi="Times New Roman" w:eastAsia="宋体"/>
-                <w:b w:val="0"/>
-                <w:sz w:val="21"/>
-              </w:rPr>
-              <w:t>实验第 24 题</w:t>
-            </w:r>
-          </w:p>
-        </w:tc>
-        <w:tc>
-          <w:tcPr>
-            <w:tcW w:type="dxa" w:w="2466"/>
-          </w:tcPr>
-          <w:p>
-            <w:pPr>
-              <w:spacing w:after="20"/>
-            </w:pPr>
-            <w:r>
-              <w:rPr>
-                <w:rFonts w:ascii="Times New Roman" w:hAnsi="Times New Roman" w:eastAsia="宋体"/>
-                <w:b w:val="0"/>
-                <w:sz w:val="21"/>
-              </w:rPr>
-              <w:t>金属（活动性、冶炼）</w:t>
-            </w:r>
-          </w:p>
-        </w:tc>
-        <w:tc>
-          <w:tcPr>
-            <w:tcW w:type="dxa" w:w="2466"/>
-          </w:tcPr>
-          <w:p>
-            <w:pPr>
-              <w:spacing w:after="20"/>
-            </w:pPr>
-            <w:r>
-              <w:rPr>
-                <w:rFonts w:ascii="Times New Roman" w:hAnsi="Times New Roman" w:eastAsia="宋体"/>
-                <w:b w:val="0"/>
-                <w:sz w:val="21"/>
-              </w:rPr>
-              <w:t>约 7—10 分</w:t>
-            </w:r>
-          </w:p>
-        </w:tc>
-        <w:tc>
-          <w:tcPr>
-            <w:tcW w:type="dxa" w:w="2466"/>
-          </w:tcPr>
-          <w:p>
-            <w:pPr>
-              <w:spacing w:after="20"/>
-            </w:pPr>
-            <w:r>
-              <w:rPr>
-                <w:rFonts w:ascii="Times New Roman" w:hAnsi="Times New Roman" w:eastAsia="宋体"/>
-                <w:b w:val="0"/>
-                <w:sz w:val="21"/>
-              </w:rPr>
-              <w:t>2026 年分值升到 10 分</w:t>
-            </w:r>
-          </w:p>
-        </w:tc>
-      </w:tr>
-      <w:tr>
-        <w:tc>
-          <w:tcPr>
-            <w:tcW w:type="dxa" w:w="2466"/>
-          </w:tcPr>
-          <w:p>
-            <w:pPr>
-              <w:spacing w:after="20"/>
-            </w:pPr>
-            <w:r>
-              <w:rPr>
-                <w:rFonts w:ascii="Times New Roman" w:hAnsi="Times New Roman" w:eastAsia="宋体"/>
-                <w:b w:val="0"/>
-                <w:sz w:val="21"/>
-              </w:rPr>
-              <w:t>计算第 26 题</w:t>
-            </w:r>
-          </w:p>
-        </w:tc>
-        <w:tc>
-          <w:tcPr>
-            <w:tcW w:type="dxa" w:w="2466"/>
-          </w:tcPr>
-          <w:p>
-            <w:pPr>
-              <w:spacing w:after="20"/>
-            </w:pPr>
-            <w:r>
-              <w:rPr>
-                <w:rFonts w:ascii="Times New Roman" w:hAnsi="Times New Roman" w:eastAsia="宋体"/>
-                <w:b w:val="0"/>
-                <w:sz w:val="21"/>
-              </w:rPr>
-              <w:t>综合方程式计算</w:t>
-            </w:r>
-          </w:p>
-        </w:tc>
-        <w:tc>
-          <w:tcPr>
-            <w:tcW w:type="dxa" w:w="2466"/>
-          </w:tcPr>
-          <w:p>
-            <w:pPr>
-              <w:spacing w:after="20"/>
-            </w:pPr>
-            <w:r>
-              <w:rPr>
-                <w:rFonts w:ascii="Times New Roman" w:hAnsi="Times New Roman" w:eastAsia="宋体"/>
-                <w:b w:val="0"/>
-                <w:sz w:val="21"/>
-              </w:rPr>
-              <w:t>约 7 分</w:t>
-            </w:r>
-          </w:p>
-        </w:tc>
-        <w:tc>
-          <w:tcPr>
-            <w:tcW w:type="dxa" w:w="2466"/>
-          </w:tcPr>
-          <w:p>
-            <w:pPr>
-              <w:spacing w:after="20"/>
-            </w:pPr>
-            <w:r>
-              <w:rPr>
-                <w:rFonts w:ascii="Times New Roman" w:hAnsi="Times New Roman" w:eastAsia="宋体"/>
-                <w:b w:val="0"/>
-                <w:sz w:val="21"/>
-              </w:rPr>
-              <w:t>最后一问较难</w:t>
-            </w:r>
-          </w:p>
-        </w:tc>
-      </w:tr>
-    </w:tbl>
-    <w:p>
-      <w:r>
-        <w:rPr>
-          <w:rFonts w:ascii="Times New Roman" w:hAnsi="Times New Roman" w:eastAsia="宋体"/>
-          <w:b w:val="0"/>
-          <w:sz w:val="23"/>
-        </w:rPr>
-        <w:t>计算第 26 题最后一小问，五年里几乎都考“浓溶液加水配成稀溶液”，套路固定，练会了就能拿；前面的小问更基础，不要放弃。</w:t>
-      </w:r>
-    </w:p>
-    <w:p>
-      <w:pPr>
-        <w:shd w:val="clear" w:fill="DEEBF7"/>
-        <w:spacing w:before="240" w:after="100"/>
-      </w:pPr>
-      <w:r>
-        <w:rPr>
-          <w:rFonts w:ascii="Times New Roman" w:hAnsi="Times New Roman" w:eastAsia="黑体"/>
-          <w:b/>
-          <w:color w:val="1F3A5F"/>
-          <w:sz w:val="27"/>
-        </w:rPr>
-        <w:t>四、这几年出题的新动向</w:t>
-      </w:r>
-    </w:p>
-    <w:p>
-      <w:pPr>
-        <w:spacing w:after="60"/>
-        <w:ind w:left="340"/>
-      </w:pPr>
-      <w:r>
-        <w:rPr>
-          <w:rFonts w:ascii="Times New Roman" w:hAnsi="Times New Roman" w:eastAsia="宋体"/>
-          <w:b w:val="0"/>
-          <w:sz w:val="23"/>
-        </w:rPr>
-        <w:t>（1）实验题比重在上升：2026 年实验题占到 26 分（约四分之一），比前几年更高，要多花时间练实验。</w:t>
-      </w:r>
-    </w:p>
-    <w:p>
-      <w:pPr>
-        <w:spacing w:after="60"/>
-        <w:ind w:left="340"/>
-      </w:pPr>
-      <w:r>
-        <w:rPr>
-          <w:rFonts w:ascii="Times New Roman" w:hAnsi="Times New Roman" w:eastAsia="宋体"/>
-          <w:b w:val="0"/>
-          <w:sz w:val="23"/>
-        </w:rPr>
-        <w:t>（2）计算题套路稳定：第 26 题最后一问几乎年年是“浓配稀”，第 25 题年年一种新物质考化学式。</w:t>
-      </w:r>
-    </w:p>
-    <w:p>
-      <w:pPr>
-        <w:spacing w:after="60"/>
-        <w:ind w:left="340"/>
-      </w:pPr>
-      <w:r>
-        <w:rPr>
-          <w:rFonts w:ascii="Times New Roman" w:hAnsi="Times New Roman" w:eastAsia="宋体"/>
-          <w:b w:val="0"/>
-          <w:sz w:val="23"/>
-        </w:rPr>
-        <w:t>（3）本地与科技素材多：小站稻、煎饼果子、天津之眼，以及神舟飞船、月壤、新型催化剂等，材料新、考点不变。</w:t>
-      </w:r>
-    </w:p>
-    <w:p>
-      <w:pPr>
-        <w:spacing w:after="60"/>
-        <w:ind w:left="340"/>
-      </w:pPr>
-      <w:r>
-        <w:rPr>
-          <w:rFonts w:ascii="Times New Roman" w:hAnsi="Times New Roman" w:eastAsia="宋体"/>
-          <w:b w:val="0"/>
-          <w:sz w:val="23"/>
-        </w:rPr>
-        <w:t>（4）整体稳定：26 道题的考点和位置五年高度一致。</w:t>
-      </w:r>
-    </w:p>
-    <w:p>
-      <w:pPr>
-        <w:shd w:val="clear" w:fill="DEEBF7"/>
-        <w:spacing w:before="240" w:after="100"/>
-      </w:pPr>
-      <w:r>
-        <w:rPr>
-          <w:rFonts w:ascii="Times New Roman" w:hAnsi="Times New Roman" w:eastAsia="黑体"/>
-          <w:b/>
-          <w:color w:val="1F3A5F"/>
-          <w:sz w:val="27"/>
-        </w:rPr>
-        <w:t>五、给您的补习建议</w:t>
-      </w:r>
-    </w:p>
-    <w:p>
-      <w:pPr>
-        <w:spacing w:after="60"/>
-        <w:ind w:left="340"/>
-      </w:pPr>
-      <w:r>
-        <w:rPr>
-          <w:rFonts w:ascii="Times New Roman" w:hAnsi="Times New Roman" w:eastAsia="宋体"/>
-          <w:b w:val="0"/>
-          <w:sz w:val="23"/>
-        </w:rPr>
-        <w:t>（1）第一步稳基础盘（约 60 分）：选择前 7 题、填空第 16、17 题、简答第 19 题方程式、计算第 25 题，以及实验第 22 题前两问，先记熟记牢。</w:t>
-      </w:r>
-    </w:p>
-    <w:p>
-      <w:pPr>
-        <w:spacing w:after="60"/>
-        <w:ind w:left="340"/>
-      </w:pPr>
-      <w:r>
-        <w:rPr>
-          <w:rFonts w:ascii="Times New Roman" w:hAnsi="Times New Roman" w:eastAsia="宋体"/>
-          <w:b w:val="0"/>
-          <w:sz w:val="23"/>
-        </w:rPr>
-        <w:t>（2）第二步争取中档分：实验第 22 题做完整，简答中的溶液、气体题拿全。</w:t>
-      </w:r>
-    </w:p>
-    <w:p>
-      <w:pPr>
-        <w:spacing w:after="60"/>
-        <w:ind w:left="340"/>
-      </w:pPr>
-      <w:r>
-        <w:rPr>
-          <w:rFonts w:ascii="Times New Roman" w:hAnsi="Times New Roman" w:eastAsia="宋体"/>
-          <w:b w:val="0"/>
-          <w:sz w:val="23"/>
-        </w:rPr>
-        <w:t>（3）难题量力而行：多选最后两题、实验第 23、24 题探究部分、计算第 26 题最后一问，能拿多少拿多少。</w:t>
-      </w:r>
-    </w:p>
-    <w:p>
-      <w:pPr>
-        <w:spacing w:after="60"/>
-        <w:ind w:left="340"/>
-      </w:pPr>
-      <w:r>
-        <w:rPr>
-          <w:rFonts w:ascii="Times New Roman" w:hAnsi="Times New Roman" w:eastAsia="宋体"/>
-          <w:b w:val="0"/>
-          <w:sz w:val="23"/>
-        </w:rPr>
-        <w:t>（4）化学提分关键在“记背加归类”：常见元素化合价、化学方程式、常见物质性质是三大基本功；把零碎知识按专题归好类，记得牢、用得出。</w:t>
+        <w:t>五 按错题安排练习</w:t>
       </w:r>
     </w:p>
     <w:p>
       <w:r>
-        <w:rPr>
-          <w:rFonts w:ascii="Times New Roman" w:hAnsi="Times New Roman" w:eastAsia="宋体"/>
-          <w:b w:val="0"/>
-          <w:sz w:val="23"/>
-        </w:rPr>
-        <w:t>总的来说，天津中考化学虽然知识点碎，但套路稳定、送分题多。孩子只要肯记肯练，把基础盘和固定套路拿稳，提分会比较明显。咱们一步一步来。</w:t>
+        <w:t>先选少量近期错题，区分是概念不清、计算错误、读题遗漏还是步骤表达不完整。每次集中解决一个问题，再用同类题检查是否会独立完成。基础稳定后逐步增加综合度，练习目标由实际表现调整。</w:t>
       </w:r>
     </w:p>
     <w:sectPr>
       <w:pgSz w:w="11906" w:h="16838"/>
-      <w:pgMar w:top="1020" w:right="1020" w:bottom="1020" w:left="1020" w:header="720" w:footer="720" w:gutter="0"/>
+      <w:pgMar w:top="907" w:right="850" w:bottom="907" w:left="850" w:header="720" w:footer="720" w:gutter="0"/>
       <w:cols w:space="720"/>
       <w:docGrid w:linePitch="360"/>
     </w:sectPr>
@@ -1894,11 +891,12 @@
     <w:qFormat/>
     <w:rsid w:val="00FC693F"/>
     <w:pPr>
-      <w:spacing w:line="300" w:lineRule="auto" w:after="80"/>
+      <w:spacing w:after="80" w:line="252" w:lineRule="auto"/>
     </w:pPr>
     <w:rPr>
-      <w:rFonts w:ascii="Times New Roman" w:hAnsi="Times New Roman" w:eastAsia="宋体"/>
-      <w:sz w:val="23"/>
+      <w:rFonts w:ascii="Noto Sans CJK SC" w:hAnsi="Noto Sans CJK SC" w:eastAsia="Noto Sans CJK SC"/>
+      <w:color w:val="000000"/>
+      <w:sz w:val="20"/>
     </w:rPr>
   </w:style>
   <w:style w:type="paragraph" w:styleId="Header">
@@ -1956,14 +954,14 @@
     <w:pPr>
       <w:keepNext/>
       <w:keepLines/>
-      <w:spacing w:before="480" w:after="0"/>
+      <w:spacing w:before="160" w:after="80" w:line="269" w:lineRule="auto"/>
       <w:outlineLvl w:val="0"/>
     </w:pPr>
     <w:rPr>
-      <w:rFonts w:asciiTheme="majorHAnsi" w:eastAsiaTheme="majorEastAsia" w:hAnsiTheme="majorHAnsi" w:cstheme="majorBidi"/>
+      <w:rFonts w:asciiTheme="majorHAnsi" w:eastAsiaTheme="majorEastAsia" w:hAnsiTheme="majorHAnsi" w:cstheme="majorBidi" w:ascii="Noto Sans CJK SC" w:hAnsi="Noto Sans CJK SC" w:eastAsia="Noto Sans CJK SC"/>
       <w:b/>
       <w:bCs/>
-      <w:color w:val="365F91" w:themeColor="accent1" w:themeShade="BF"/>
+      <w:color w:val="000000"/>
       <w:sz w:val="28"/>
       <w:szCs w:val="28"/>
     </w:rPr>
@@ -1980,14 +978,14 @@
     <w:pPr>
       <w:keepNext/>
       <w:keepLines/>
-      <w:spacing w:before="200" w:after="0"/>
+      <w:spacing w:before="200" w:after="100" w:line="269" w:lineRule="auto"/>
       <w:outlineLvl w:val="1"/>
     </w:pPr>
     <w:rPr>
-      <w:rFonts w:asciiTheme="majorHAnsi" w:eastAsiaTheme="majorEastAsia" w:hAnsiTheme="majorHAnsi" w:cstheme="majorBidi"/>
+      <w:rFonts w:asciiTheme="majorHAnsi" w:eastAsiaTheme="majorEastAsia" w:hAnsiTheme="majorHAnsi" w:cstheme="majorBidi" w:ascii="Noto Sans CJK SC" w:hAnsi="Noto Sans CJK SC" w:eastAsia="Noto Sans CJK SC"/>
       <w:b/>
       <w:bCs/>
-      <w:color w:val="4F81BD" w:themeColor="accent1"/>
+      <w:color w:val="000000"/>
       <w:sz w:val="26"/>
       <w:szCs w:val="26"/>
     </w:rPr>
@@ -2004,14 +1002,15 @@
     <w:pPr>
       <w:keepNext/>
       <w:keepLines/>
-      <w:spacing w:before="200" w:after="0"/>
+      <w:spacing w:before="200" w:after="100" w:line="269" w:lineRule="auto"/>
       <w:outlineLvl w:val="2"/>
     </w:pPr>
     <w:rPr>
-      <w:rFonts w:asciiTheme="majorHAnsi" w:eastAsiaTheme="majorEastAsia" w:hAnsiTheme="majorHAnsi" w:cstheme="majorBidi"/>
+      <w:rFonts w:asciiTheme="majorHAnsi" w:eastAsiaTheme="majorEastAsia" w:hAnsiTheme="majorHAnsi" w:cstheme="majorBidi" w:ascii="Noto Sans CJK SC" w:hAnsi="Noto Sans CJK SC" w:eastAsia="Noto Sans CJK SC"/>
       <w:b/>
       <w:bCs/>
-      <w:color w:val="4F81BD" w:themeColor="accent1"/>
+      <w:color w:val="000000"/>
+      <w:sz w:val="22"/>
     </w:rPr>
   </w:style>
   <w:style w:type="paragraph" w:styleId="Heading4">
@@ -2242,18 +1241,15 @@
     <w:qFormat/>
     <w:rsid w:val="00FC693F"/>
     <w:pPr>
-      <w:pBdr>
-        <w:bottom w:val="single" w:sz="8" w:space="4" w:color="4F81BD" w:themeColor="accent1"/>
-      </w:pBdr>
-      <w:spacing w:after="300" w:line="240" w:lineRule="auto"/>
+      <w:spacing w:after="100" w:line="269" w:lineRule="auto"/>
       <w:contextualSpacing/>
     </w:pPr>
     <w:rPr>
-      <w:rFonts w:asciiTheme="majorHAnsi" w:eastAsiaTheme="majorEastAsia" w:hAnsiTheme="majorHAnsi" w:cstheme="majorBidi"/>
-      <w:color w:val="17365D" w:themeColor="text2" w:themeShade="BF"/>
+      <w:rFonts w:asciiTheme="majorHAnsi" w:eastAsiaTheme="majorEastAsia" w:hAnsiTheme="majorHAnsi" w:cstheme="majorBidi" w:ascii="Noto Sans CJK SC" w:hAnsi="Noto Sans CJK SC" w:eastAsia="Noto Sans CJK SC"/>
+      <w:color w:val="000000"/>
       <w:spacing w:val="5"/>
       <w:kern w:val="28"/>
-      <w:sz w:val="52"/>
+      <w:sz w:val="36"/>
       <w:szCs w:val="52"/>
     </w:rPr>
   </w:style>
@@ -2729,9 +1725,6 @@
     <w:qFormat/>
     <w:rsid w:val="00FC693F"/>
     <w:pPr>
-      <w:pBdr>
-        <w:bottom w:val="single" w:sz="4" w:space="4" w:color="4F81BD" w:themeColor="accent1"/>
-      </w:pBdr>
       <w:spacing w:before="200" w:after="280"/>
       <w:ind w:left="936" w:right="936"/>
     </w:pPr>

</xml_diff>